<commit_message>
Deployed 4eaf3d1b with MkDocs version: 1.6.1
</commit_message>
<xml_diff>
--- a/download/notice.docx
+++ b/download/notice.docx
@@ -1395,6 +1395,9 @@
             <w:pPr>
               <w:pStyle w:val="Compact"/>
             </w:pPr>
+            <w:r>
+              <w:t xml:space="preserve">Object</w:t>
+            </w:r>
             <w:r>
               <w:t xml:space="preserve">Read only</w:t>
             </w:r>
@@ -2971,7 +2974,7 @@
     <w:bookmarkEnd w:id="44"/>
     <w:bookmarkEnd w:id="45"/>
     <w:sectPr>
-      <w:headerReference r:id="rId9" w:type="default"/>
+      <w:headerReference r:id="rId11" w:type="default"/>
       <w:pgSz w:h="11906" w:orient="landscape" w:w="16838"/>
       <w:pgMar w:bottom="1417" w:footer="708" w:gutter="0" w:header="708" w:left="1417" w:right="1417" w:top="1417"/>
       <w:cols w:space="708"/>

</xml_diff>

<commit_message>
Deployed 24e53883 with MkDocs version: 1.6.1
</commit_message>
<xml_diff>
--- a/download/notice.docx
+++ b/download/notice.docx
@@ -168,6 +168,52 @@
             </w:pPr>
             <w:r>
               <w:t xml:space="preserve">Update CUSP to match the updated end user data from Elhub</w:t>
+            </w:r>
+          </w:p>
+        </w:tc>
+      </w:tr>
+      <w:tr>
+        <w:tc>
+          <w:tcPr/>
+          <w:p>
+            <w:pPr>
+              <w:pStyle w:val="Compact"/>
+            </w:pPr>
+            <w:r>
+              <w:t xml:space="preserve">no.elhub.flex.controllable_unit.maximum_active_power.ratio</w:t>
+            </w:r>
+          </w:p>
+        </w:tc>
+        <w:tc>
+          <w:tcPr/>
+          <w:p>
+            <w:pPr>
+              <w:pStyle w:val="Compact"/>
+            </w:pPr>
+            <w:r>
+              <w:t xml:space="preserve">Inconsistency: Flexible power exceeds rated power</w:t>
+            </w:r>
+          </w:p>
+        </w:tc>
+        <w:tc>
+          <w:tcPr/>
+          <w:p>
+            <w:pPr>
+              <w:pStyle w:val="Compact"/>
+            </w:pPr>
+            <w:r>
+              <w:t xml:space="preserve">SP</w:t>
+            </w:r>
+          </w:p>
+        </w:tc>
+        <w:tc>
+          <w:tcPr/>
+          <w:p>
+            <w:pPr>
+              <w:pStyle w:val="Compact"/>
+            </w:pPr>
+            <w:r>
+              <w:t xml:space="preserve">Update the flexible power or add technical resources</w:t>
             </w:r>
           </w:p>
         </w:tc>

</xml_diff>